<commit_message>
fix: Nadia actualiza rol Asesor en Manual Calificaciones Secundario — puede modificar y completar datos
</commit_message>
<xml_diff>
--- a/public/manuales/Manual_Calificaciones_Secundario_2026.docx
+++ b/public/manuales/Manual_Calificaciones_Secundario_2026.docx
@@ -784,7 +784,7 @@
                 <w:sz w:val="18"/>
                 <w:szCs w:val="18"/>
               </w:rPr>
-              <w:t xml:space="preserve">Acceso de lectura a los establecimientos asignados. Puede visualizar estados, solapas y calificaciones cargadas, pero no puede modificarlas.</w:t>
+              <w:t xml:space="preserve">Puede consultar y gestionar información de los establecimientos asignados. Puede modificar y completar datos cuando el establecimiento lo solicita.</w:t>
             </w:r>
           </w:p>
         </w:tc>
@@ -3477,7 +3477,7 @@
           <w:sz w:val="18"/>
           <w:szCs w:val="18"/>
         </w:rPr>
-        <w:t xml:space="preserve">El asesor no puede reabrir calificaciones directamente. Si el directivo no puede hacerlo, escalar a la Dirección de Área con el detalle del caso: CUE, espacio curricular, división y descripción del error.</w:t>
+        <w:t xml:space="preserve">El asesor puede gestionar la reapertura de calificaciones cuando el directivo no puede resolverlo. Si se requiere intervención técnica, escalar a la Dirección de Área con el detalle: CUE, espacio curricular, división y descripción del error.</w:t>
       </w:r>
     </w:p>
     <w:p>
@@ -4167,7 +4167,7 @@
           <w:sz w:val="20"/>
           <w:szCs w:val="20"/>
         </w:rPr>
-        <w:t xml:space="preserve">El asesor no interviene directamente en la generación de boletines. Tu tarea es verificar, antes del cierre, que todos los espacios curriculares del establecimiento estén en estado Calificado. Si hay pendientes, alertar al directivo con tiempo suficiente para que el docente complete la carga.</w:t>
+        <w:t xml:space="preserve">El asesor puede intervenir en la verificación y seguimiento del proceso de generación de boletines. Tu tarea es verificar, antes del cierre, que todos los espacios curriculares del establecimiento estén en estado Calificado. Si hay pendientes, alertar al directivo con tiempo suficiente para que el docente complete la carga.</w:t>
       </w:r>
     </w:p>
     <w:p>

</xml_diff>